<commit_message>
Document Chapter 8 (Authentication & Authorization) outcome in project brief
Mirrors the Chapter 7 (Telerik) pattern: appends what was actually
implemented and why it diverges from the original ask (local
simulated auth instead of immediate Azure AD/Entra ID, since no
tenant/app registration exists yet), for historical record alongside
the original requirement text.

Co-Authored-By: Claude Sonnet 5 <noreply@anthropic.com>
</commit_message>
<xml_diff>
--- a/docs/prompt/ProjektErstellung.docx
+++ b/docs/prompt/ProjektErstellung.docx
@@ -11139,6 +11139,188 @@
           <w:sz w:val="21"/>
         </w:rPr>
       </w:pPr>
+    </w:p>
+    <w:p>
+      <w:pPr>
+        <w:spacing w:after="120" w:line="242" w:lineRule="auto"/>
+        <w:rPr>
+          <w:rFonts w:ascii="Aptos" w:hAnsi="Aptos"/>
+          <w:b/>
+          <w:color w:val="243447"/>
+          <w:sz w:val="21"/>
+        </w:rPr>
+      </w:pPr>
+      <w:r>
+        <w:rPr>
+          <w:rFonts w:ascii="Aptos" w:hAnsi="Aptos"/>
+          <w:b/>
+          <w:color w:val="243447"/>
+          <w:sz w:val="21"/>
+        </w:rPr>
+        <w:t>Update / Umsetzung (nachträglich ergänzt):</w:t>
+      </w:r>
+    </w:p>
+    <w:p>
+      <w:pPr>
+        <w:spacing w:after="120" w:line="242" w:lineRule="auto"/>
+        <w:rPr>
+          <w:rFonts w:ascii="Aptos" w:hAnsi="Aptos"/>
+          <w:color w:val="243447"/>
+          <w:sz w:val="21"/>
+        </w:rPr>
+      </w:pPr>
+      <w:r>
+        <w:rPr>
+          <w:rFonts w:ascii="Aptos" w:hAnsi="Aptos"/>
+          <w:color w:val="243447"/>
+          <w:sz w:val="21"/>
+        </w:rPr>
+        <w:t>Die Rollen BankEmployee, OperationsManager und Administrator wurden umgesetzt - allerdings zunächst mit lokal simulierter Authentifizierung statt sofortiger Azure AD/Entra ID-Anbindung (kein Tenant/App-Registrierung vorhanden, ähnliche Situation wie beim Telerik-Kapitel). Die ursprünglich vorgesehene Azure-AD-Integration (siehe ADR-0008) bleibt als spätere Migration möglich, ohne dass sich am Rollen-/Autorisierungsmodell etwas ändert - nur der Token-Aussteller würde wechseln.</w:t>
+      </w:r>
+    </w:p>
+    <w:p>
+      <w:pPr>
+        <w:spacing w:after="120" w:line="242" w:lineRule="auto"/>
+        <w:rPr>
+          <w:rFonts w:ascii="Aptos" w:hAnsi="Aptos"/>
+          <w:color w:val="243447"/>
+          <w:sz w:val="21"/>
+        </w:rPr>
+      </w:pPr>
+      <w:r>
+        <w:rPr>
+          <w:rFonts w:ascii="Aptos" w:hAnsi="Aptos"/>
+          <w:color w:val="243447"/>
+          <w:sz w:val="21"/>
+        </w:rPr>
+        <w:t>Details der Umsetzung:</w:t>
+      </w:r>
+    </w:p>
+    <w:p>
+      <w:pPr>
+        <w:spacing w:after="120" w:line="242" w:lineRule="auto"/>
+        <w:rPr>
+          <w:rFonts w:ascii="Aptos" w:hAnsi="Aptos"/>
+          <w:color w:val="243447"/>
+          <w:sz w:val="21"/>
+        </w:rPr>
+      </w:pPr>
+      <w:r>
+        <w:rPr>
+          <w:rFonts w:ascii="Aptos" w:hAnsi="Aptos"/>
+          <w:color w:val="243447"/>
+          <w:sz w:val="21"/>
+        </w:rPr>
+        <w:t>Cookie-Authentifizierung im Blazor-Server-Frontend mit drei lokalen Demo-Nutzern (employee/manager/admin, Passwort jeweils Demo123!, Passwörter korrekt mit PBKDF2 gehasht statt im Klartext verglichen).</w:t>
+      </w:r>
+    </w:p>
+    <w:p>
+      <w:pPr>
+        <w:spacing w:after="120" w:line="242" w:lineRule="auto"/>
+        <w:rPr>
+          <w:rFonts w:ascii="Aptos" w:hAnsi="Aptos"/>
+          <w:color w:val="243447"/>
+          <w:sz w:val="21"/>
+        </w:rPr>
+      </w:pPr>
+      <w:r>
+        <w:rPr>
+          <w:rFonts w:ascii="Aptos" w:hAnsi="Aptos"/>
+          <w:color w:val="243447"/>
+          <w:sz w:val="21"/>
+        </w:rPr>
+        <w:t>Rollenhierarchie über kumulative Claims: OperationsManager trägt zusätzlich die BankEmployee-Rolle, Administrator trägt alle drei Rollen - dadurch deckt ein einfaches [Authorize(Roles = "BankEmployee")] automatisch auch höhere Rollen ab, ohne eigene Hierarchie-Policy-Engine.</w:t>
+      </w:r>
+    </w:p>
+    <w:p>
+      <w:pPr>
+        <w:spacing w:after="120" w:line="242" w:lineRule="auto"/>
+        <w:rPr>
+          <w:rFonts w:ascii="Aptos" w:hAnsi="Aptos"/>
+          <w:color w:val="243447"/>
+          <w:sz w:val="21"/>
+        </w:rPr>
+      </w:pPr>
+      <w:r>
+        <w:rPr>
+          <w:rFonts w:ascii="Aptos" w:hAnsi="Aptos"/>
+          <w:color w:val="243447"/>
+          <w:sz w:val="21"/>
+        </w:rPr>
+        <w:t>BFF-Pattern (Backend for Frontend): Banking.Web mintet pro ausgehendem Api-Aufruf ein kurzlebiges JWT (5 Minuten Gültigkeit) aus den Cookie-Claims des angemeldeten Nutzers. Banking.Api validiert dieses Token vollständig unabhängig von der Blazor-Oberfläche.</w:t>
+      </w:r>
+    </w:p>
+    <w:p>
+      <w:pPr>
+        <w:spacing w:after="120" w:line="242" w:lineRule="auto"/>
+        <w:rPr>
+          <w:rFonts w:ascii="Aptos" w:hAnsi="Aptos"/>
+          <w:color w:val="243447"/>
+          <w:sz w:val="21"/>
+        </w:rPr>
+      </w:pPr>
+      <w:r>
+        <w:rPr>
+          <w:rFonts w:ascii="Aptos" w:hAnsi="Aptos"/>
+          <w:color w:val="243447"/>
+          <w:sz w:val="21"/>
+        </w:rPr>
+        <w:t>Banking.Api ist "secure by default": eine FallbackPolicy verlangt für jeden Endpunkt eine Authentifizierung, sofern er nicht explizit mit [AllowAnonymous] markiert ist.</w:t>
+      </w:r>
+    </w:p>
+    <w:p>
+      <w:pPr>
+        <w:spacing w:after="120" w:line="242" w:lineRule="auto"/>
+        <w:rPr>
+          <w:rFonts w:ascii="Aptos" w:hAnsi="Aptos"/>
+          <w:color w:val="243447"/>
+          <w:sz w:val="21"/>
+        </w:rPr>
+      </w:pPr>
+      <w:r>
+        <w:rPr>
+          <w:rFonts w:ascii="Aptos" w:hAnsi="Aptos"/>
+          <w:color w:val="243447"/>
+          <w:sz w:val="21"/>
+        </w:rPr>
+        <w:t>Ergänzt wurden Approve/Reject-Endpunkte für Zahlungsaufträge (OperationsManager-Recht "Payments bearbeiten"), da dafür vorher noch keine Funktionalität existierte - ohne diese Ergänzung wäre die Rolle nicht sinnvoll testbar gewesen.</w:t>
+      </w:r>
+    </w:p>
+    <w:p>
+      <w:pPr>
+        <w:spacing w:after="120" w:line="242" w:lineRule="auto"/>
+        <w:rPr>
+          <w:rFonts w:ascii="Aptos" w:hAnsi="Aptos"/>
+          <w:color w:val="243447"/>
+          <w:sz w:val="21"/>
+        </w:rPr>
+      </w:pPr>
+      <w:r>
+        <w:rPr>
+          <w:rFonts w:ascii="Aptos" w:hAnsi="Aptos"/>
+          <w:color w:val="243447"/>
+          <w:sz w:val="21"/>
+        </w:rPr>
+        <w:t>Verifiziert direkt gegen die Api mit eigens erzeugten Tokens, unabhängig von der Blazor-Oberfläche: 401 ohne Token, 403 bei falscher Rolle, 200/404 bei korrekter Rolle. Zusätzlich der komplette Fluss getestet: BankEmployee legt Zahlung an, kann sie nicht selbst genehmigen (403), OperationsManager genehmigt erfolgreich.</w:t>
+      </w:r>
+    </w:p>
+    <w:p>
+      <w:pPr>
+        <w:spacing w:after="120" w:line="242" w:lineRule="auto"/>
+        <w:rPr>
+          <w:rFonts w:ascii="Aptos" w:hAnsi="Aptos"/>
+          <w:color w:val="243447"/>
+          <w:sz w:val="21"/>
+        </w:rPr>
+      </w:pPr>
+      <w:r>
+        <w:rPr>
+          <w:rFonts w:ascii="Aptos" w:hAnsi="Aptos"/>
+          <w:color w:val="243447"/>
+          <w:sz w:val="21"/>
+        </w:rPr>
+        <w:t>Bewusst nicht umgesetzt: Audit-Logging von Autorisierungsfehlern (z. B. wiederholte 403-Antworten) - siehe ADR #14, hängt am noch nicht gebauten Auditing-Modul.</w:t>
+      </w:r>
       <w:r>
         <w:rPr>
           <w:rFonts w:ascii="Aptos" w:hAnsi="Aptos"/>

</xml_diff>

<commit_message>
Add SAP customer master data integration (Anti-Corruption Layer, Chapter 11)
Adds ISapCustomerService with a HttpClient-based real adapter (SapRfcCustomerService,
resilience via Microsoft.Extensions.Http.Resilience) and a deterministic mock as the
local default, plus a new "Customer 360" endpoint (GET /api/customers/{id}/sap-profile)
that gracefully degrades to local-only data when SAP is unavailable instead of failing
the whole request.

Co-Authored-By: Claude Sonnet 5 <noreply@anthropic.com>
</commit_message>
<xml_diff>
--- a/docs/prompt/ProjektErstellung.docx
+++ b/docs/prompt/ProjektErstellung.docx
@@ -13238,6 +13238,159 @@
           <w:sz w:val="21"/>
         </w:rPr>
         <w:t>Falls eine echte SAP-RFC-Library nicht verfügbar ist, implementiere eine realistische Abstraktion und Mock-Integration statt eine nicht funktionierende SAP-Verbindung zu erfinden.</w:t>
+      </w:r>
+    </w:p>
+    <w:p>
+      <w:pPr>
+        <w:rPr>
+          <w:b/>
+        </w:rPr>
+      </w:pPr>
+      <w:r>
+        <w:rPr>
+          <w:b/>
+        </w:rPr>
+        <w:t>Update / Umsetzung (nachträglich ergänzt):</w:t>
+      </w:r>
+    </w:p>
+    <w:p>
+      <w:pPr>
+        <w:spacing w:after="120" w:line="242" w:lineRule="auto"/>
+        <w:rPr>
+          <w:rStyle w:val="Platzhaltertext"/>
+        </w:rPr>
+      </w:pPr>
+      <w:r>
+        <w:rPr>
+          <w:rStyle w:val="Platzhaltertext"/>
+        </w:rPr>
+        <w:t>Echtes SAP-RFC/BAPI über den SAP .NET Connector (NCo) war nicht umsetzbar: diese Bibliothek ist proprietär, gibt es nicht auf NuGet und ist nur mit aktivem SAP-Vertrag/-Account beziehbar - ohne SAP-Zugangsdaten weder kompilier- noch testbar. Wie im Anforderungstext selbst vorgesehen ("falls eine echte SAP-RFC-Library nicht verfügbar ist, implementiere eine realistische Abstraktion und Mock-Integration") wurde stattdessen ein realistischer Adapter gebaut. Details/Begründung: ADR #19 in decisions-backlog.md sowie docs/architecture/sap-integration.md.</w:t>
+      </w:r>
+    </w:p>
+    <w:p>
+      <w:pPr>
+        <w:spacing w:after="120" w:line="242" w:lineRule="auto"/>
+        <w:rPr>
+          <w:rStyle w:val="Platzhaltertext"/>
+        </w:rPr>
+      </w:pPr>
+      <w:r>
+        <w:rPr>
+          <w:rStyle w:val="Platzhaltertext"/>
+        </w:rPr>
+        <w:t>ISapCustomerService (in Banking.Application, keine SAP-Abhängigkeit) mit GetCustomerAsync() und GetAccountAsync() wie gefordert - Domain/Application kennen ausschließlich dieses Interface und eigene, SAP-unabhängige DTOs (SapCustomerProfile, SapAccountInfo).</w:t>
+      </w:r>
+    </w:p>
+    <w:p>
+      <w:pPr>
+        <w:spacing w:after="120" w:line="242" w:lineRule="auto"/>
+        <w:rPr>
+          <w:rStyle w:val="Platzhaltertext"/>
+        </w:rPr>
+      </w:pPr>
+      <w:r>
+        <w:rPr>
+          <w:rStyle w:val="Platzhaltertext"/>
+        </w:rPr>
+        <w:t>SapRfcCustomerService (in Banking.Infrastructure) bildet das in der Praxis verbreitete Muster "RFC-fähiges SAP-Gateway/OData-Service" über einen normalen HttpClient ab, statt über direktes RFC - dadurch tatsächlich lauffähiger, kompilier- und testbarer Code statt einer nur behaupteten SAP-Verbindung.</w:t>
+      </w:r>
+    </w:p>
+    <w:p>
+      <w:pPr>
+        <w:spacing w:after="120" w:line="242" w:lineRule="auto"/>
+        <w:rPr>
+          <w:rStyle w:val="Platzhaltertext"/>
+        </w:rPr>
+      </w:pPr>
+      <w:r>
+        <w:rPr>
+          <w:rStyle w:val="Platzhaltertext"/>
+        </w:rPr>
+        <w:t>MockSapCustomerService (ebenfalls in Banking.Infrastructure) ist der Standard ohne konfigurierte Sap:BaseUrl - liefert deterministische Fake-Daten und simuliert realistische Latenz sowie reproduzierbare Ausfälle, dasselbe Gate-Muster wie bei Key Vault/App Configuration (Kapitel 9) und Application Insights (Kapitel 10).</w:t>
+      </w:r>
+    </w:p>
+    <w:p>
+      <w:pPr>
+        <w:spacing w:after="120" w:line="242" w:lineRule="auto"/>
+        <w:rPr>
+          <w:rStyle w:val="Platzhaltertext"/>
+        </w:rPr>
+      </w:pPr>
+      <w:r>
+        <w:rPr>
+          <w:rStyle w:val="Platzhaltertext"/>
+        </w:rPr>
+        <w:t>Timeout, Retry und Circuit Breaker laufen über das offizielle Microsoft-Paket Microsoft.Extensions.Http.Resilience (baut auf Polly v8 auf) als Cross-Cutting-Concern, nicht handgeschrieben in der Adapter-Klasse selbst.</w:t>
+      </w:r>
+    </w:p>
+    <w:p>
+      <w:pPr>
+        <w:spacing w:after="120" w:line="242" w:lineRule="auto"/>
+        <w:rPr>
+          <w:rStyle w:val="Platzhaltertext"/>
+        </w:rPr>
+      </w:pPr>
+      <w:r>
+        <w:rPr>
+          <w:rStyle w:val="Platzhaltertext"/>
+        </w:rPr>
+        <w:t>Fehlerbehandlung: jede technische Ausnahme (HTTP-Fehler, Timeout/Retry-Erschöpfung, fehlerhaftes JSON) wird an der Systemgrenze in eine einzige SapIntegrationException übersetzt - der Rest der Anwendung kennt nur diesen einen Fehlertyp. Eine echte Cancellation durch den Aufrufer wird davon bewusst ausgenommen und unverändert durchgereicht.</w:t>
+      </w:r>
+    </w:p>
+    <w:p>
+      <w:pPr>
+        <w:spacing w:after="120" w:line="242" w:lineRule="auto"/>
+        <w:rPr>
+          <w:rStyle w:val="Platzhaltertext"/>
+        </w:rPr>
+      </w:pPr>
+      <w:r>
+        <w:rPr>
+          <w:rStyle w:val="Platzhaltertext"/>
+        </w:rPr>
+        <w:t>Graceful Degradation statt Komplettausfall: der neue Anwendungsfall GetCustomerSapProfileHandler (GET /api/customers/{id}/sap-profile, eine "Customer 360"-Ansicht) fängt SapIntegrationException gezielt ab und liefert bei nicht erreichbarem SAP trotzdem 200 OK mit den lokalen Daten und sapAvailable=false, statt die ganze Anfrage mit 500 scheitern zu lassen.</w:t>
+      </w:r>
+    </w:p>
+    <w:p>
+      <w:pPr>
+        <w:spacing w:after="120" w:line="242" w:lineRule="auto"/>
+        <w:rPr>
+          <w:rStyle w:val="Platzhaltertext"/>
+        </w:rPr>
+      </w:pPr>
+      <w:r>
+        <w:rPr>
+          <w:rStyle w:val="Platzhaltertext"/>
+        </w:rPr>
+        <w:t>Mapping SAP-Modell und internes Domain-Modell: SapCustomerResponse/SapAccountResponse (BAPI-artige Feldnamen wie StCd1, Stras, Land1) sind ausschließlich SapRfcCustomerService bekannt, die Übersetzung passiert explizit an dieser einen Stelle.</w:t>
+      </w:r>
+    </w:p>
+    <w:p>
+      <w:pPr>
+        <w:spacing w:after="120" w:line="242" w:lineRule="auto"/>
+        <w:rPr>
+          <w:rStyle w:val="Platzhaltertext"/>
+        </w:rPr>
+      </w:pPr>
+      <w:r>
+        <w:rPr>
+          <w:rStyle w:val="Platzhaltertext"/>
+        </w:rPr>
+        <w:t>Lokal verifiziert: sowohl der Happy Path gegen MockSapCustomerService als auch der Ausfall-Pfad gegen die echte, HttpClient-basierte SapRfcCustomerService (gegen einen absichtlich nicht erreichbaren Port getestet) wurden über den laufenden Api-Endpunkt bestätigt - inklusive greifendem Retry/Timeout und korrektem sapAvailable=false statt eines Serverfehlers.</w:t>
+      </w:r>
+    </w:p>
+    <w:p>
+      <w:pPr>
+        <w:spacing w:after="120" w:line="242" w:lineRule="auto"/>
+        <w:rPr>
+          <w:rStyle w:val="Platzhaltertext"/>
+        </w:rPr>
+      </w:pPr>
+      <w:r>
+        <w:rPr>
+          <w:rStyle w:val="Platzhaltertext"/>
+        </w:rPr>
+        <w:t>Die geforderte Erklärung 'warum ein Adapter für SAP sinnvoll ist' ist ausformuliert in docs/architecture/sap-integration.md dokumentiert.</w:t>
       </w:r>
     </w:p>
     <w:p>

</xml_diff>